<commit_message>
docs: add project plan, status report, accessibility audit, and SCAPH requirements
Add documentation for project planning, weekly status tracking, accessibility
audit findings, and Phase 3 SCAPH (Student Career & Academic Planning Hub)
requirements. Includes doc generation scripts and updated design system.

Co-Authored-By: Claude Opus 4.6 (1M context) <noreply@anthropic.com>
</commit_message>
<xml_diff>
--- a/docs/ClassBridge_Design_System.docx
+++ b/docs/ClassBridge_Design_System.docx
@@ -65,7 +65,7 @@
           <w:color w:val="333333"/>
           <w:sz w:val="24"/>
         </w:rPr>
-        <w:t>1.0</w:t>
+        <w:t>2.2</w:t>
       </w:r>
     </w:p>
     <w:p>
@@ -87,7 +87,7 @@
           <w:color w:val="333333"/>
           <w:sz w:val="24"/>
         </w:rPr>
-        <w:t>2026-03-08</w:t>
+        <w:t>2026-03-27</w:t>
       </w:r>
     </w:p>
     <w:p>
@@ -198,7 +198,7 @@
     </w:p>
     <w:p>
       <w:r>
-        <w:t>Date: 2026-03-22</w:t>
+        <w:t>Date: 2026-03-27</w:t>
       </w:r>
     </w:p>
     <w:p>
@@ -3159,6 +3159,1167 @@
     <w:p>
       <w:r>
         <w:t>Updated with visibility-aware polling via usePageVisible hook. Polling for new notifications pauses automatically when the browser tab is hidden and resumes when the tab becomes visible again, reducing unnecessary API calls.</w:t>
+      </w:r>
+    </w:p>
+    <w:p>
+      <w:pPr>
+        <w:pStyle w:val="Heading3"/>
+      </w:pPr>
+      <w:r>
+        <w:t>4.20 CsvImportPage Wizard</w:t>
+      </w:r>
+    </w:p>
+    <w:p>
+      <w:r>
+        <w:t>Multi-step CSV import flow:</w:t>
+      </w:r>
+    </w:p>
+    <w:p>
+      <w:pPr>
+        <w:pStyle w:val="ListBullet"/>
+      </w:pPr>
+      <w:r>
+        <w:t>Step 1: Select template type (students, courses, assignments) — card-based selector</w:t>
+      </w:r>
+    </w:p>
+    <w:p>
+      <w:pPr>
+        <w:pStyle w:val="ListBullet"/>
+      </w:pPr>
+      <w:r>
+        <w:t>Step 2: File upload with drag-and-drop zone and file validation</w:t>
+      </w:r>
+    </w:p>
+    <w:p>
+      <w:pPr>
+        <w:pStyle w:val="ListBullet"/>
+      </w:pPr>
+      <w:r>
+        <w:t>Step 3: Preview table with row-by-row validation (green check / red X indicators)</w:t>
+      </w:r>
+    </w:p>
+    <w:p>
+      <w:pPr>
+        <w:pStyle w:val="ListBullet"/>
+      </w:pPr>
+      <w:r>
+        <w:t>Step 4: Confirm and execute import with results summary</w:t>
+      </w:r>
+    </w:p>
+    <w:p>
+      <w:pPr>
+        <w:pStyle w:val="ListBullet"/>
+      </w:pPr>
+      <w:r>
+        <w:t>Step progress indicator at top</w:t>
+      </w:r>
+    </w:p>
+    <w:p>
+      <w:pPr>
+        <w:pStyle w:val="ListBullet"/>
+      </w:pPr>
+      <w:r>
+        <w:t>Download blank template button per entity type</w:t>
+      </w:r>
+    </w:p>
+    <w:p>
+      <w:pPr>
+        <w:pStyle w:val="Heading3"/>
+      </w:pPr>
+      <w:r>
+        <w:t>4.21 TeacherThanksButton</w:t>
+      </w:r>
+    </w:p>
+    <w:p>
+      <w:r>
+        <w:t>One-click appreciation component on teacher cards and profiles:</w:t>
+      </w:r>
+    </w:p>
+    <w:p>
+      <w:pPr>
+        <w:pStyle w:val="ListBullet"/>
+      </w:pPr>
+      <w:r>
+        <w:t>Heart icon button with thank-you action</w:t>
+      </w:r>
+    </w:p>
+    <w:p>
+      <w:pPr>
+        <w:pStyle w:val="ListBullet"/>
+      </w:pPr>
+      <w:r>
+        <w:t>Daily limit indicator (dimmed after daily use)</w:t>
+      </w:r>
+    </w:p>
+    <w:p>
+      <w:pPr>
+        <w:pStyle w:val="ListBullet"/>
+      </w:pPr>
+      <w:r>
+        <w:t>Optional short message input (100 char max)</w:t>
+      </w:r>
+    </w:p>
+    <w:p>
+      <w:pPr>
+        <w:pStyle w:val="ListBullet"/>
+      </w:pPr>
+      <w:r>
+        <w:t>Total and weekly thanks count display on teacher dashboard</w:t>
+      </w:r>
+    </w:p>
+    <w:p>
+      <w:pPr>
+        <w:pStyle w:val="ListBullet"/>
+      </w:pPr>
+      <w:r>
+        <w:t>Animated heart on successful send</w:t>
+      </w:r>
+    </w:p>
+    <w:p>
+      <w:pPr>
+        <w:pStyle w:val="Heading3"/>
+      </w:pPr>
+      <w:r>
+        <w:t>4.22 WeeklyReportCard</w:t>
+      </w:r>
+    </w:p>
+    <w:p>
+      <w:r>
+        <w:t>Family report card component for parent weekly summary:</w:t>
+      </w:r>
+    </w:p>
+    <w:p>
+      <w:pPr>
+        <w:pStyle w:val="ListBullet"/>
+      </w:pPr>
+      <w:r>
+        <w:t>Per-child sections with engagement score gauge (0-100)</w:t>
+      </w:r>
+    </w:p>
+    <w:p>
+      <w:pPr>
+        <w:pStyle w:val="ListBullet"/>
+      </w:pPr>
+      <w:r>
+        <w:t>Task/assignment progress bars with completion percentages</w:t>
+      </w:r>
+    </w:p>
+    <w:p>
+      <w:pPr>
+        <w:pStyle w:val="ListBullet"/>
+      </w:pPr>
+      <w:r>
+        <w:t>Streak display with flame icon and day count</w:t>
+      </w:r>
+    </w:p>
+    <w:p>
+      <w:pPr>
+        <w:pStyle w:val="ListBullet"/>
+      </w:pPr>
+      <w:r>
+        <w:t>Upcoming deadline list (next 7 days)</w:t>
+      </w:r>
+    </w:p>
+    <w:p>
+      <w:pPr>
+        <w:pStyle w:val="ListBullet"/>
+      </w:pPr>
+      <w:r>
+        <w:t>Highlight text for notable achievements</w:t>
+      </w:r>
+    </w:p>
+    <w:p>
+      <w:pPr>
+        <w:pStyle w:val="ListBullet"/>
+      </w:pPr>
+      <w:r>
+        <w:t>Shareable via link button</w:t>
+      </w:r>
+    </w:p>
+    <w:p>
+      <w:pPr>
+        <w:pStyle w:val="Heading3"/>
+      </w:pPr>
+      <w:r>
+        <w:t>4.23 XpBadgeDisplay</w:t>
+      </w:r>
+    </w:p>
+    <w:p>
+      <w:r>
+        <w:t>Gamification display components:</w:t>
+      </w:r>
+    </w:p>
+    <w:p>
+      <w:pPr>
+        <w:pStyle w:val="ListBullet"/>
+      </w:pPr>
+      <w:r>
+        <w:t>XP level indicator with progress bar to next level</w:t>
+      </w:r>
+    </w:p>
+    <w:p>
+      <w:pPr>
+        <w:pStyle w:val="ListBullet"/>
+      </w:pPr>
+      <w:r>
+        <w:t>Current streak flame icon with day count</w:t>
+      </w:r>
+    </w:p>
+    <w:p>
+      <w:pPr>
+        <w:pStyle w:val="ListBullet"/>
+      </w:pPr>
+      <w:r>
+        <w:t>Badge gallery grid (locked badges shown as grayscale)</w:t>
+      </w:r>
+    </w:p>
+    <w:p>
+      <w:pPr>
+        <w:pStyle w:val="ListBullet"/>
+      </w:pPr>
+      <w:r>
+        <w:t>Used on student dashboard and parent's child overview cards</w:t>
+      </w:r>
+    </w:p>
+    <w:p>
+      <w:pPr>
+        <w:pStyle w:val="ListBullet"/>
+      </w:pPr>
+      <w:r>
+        <w:t>Compact variant for dashboard cards, full variant for dedicated pages</w:t>
+      </w:r>
+    </w:p>
+    <w:p>
+      <w:pPr>
+        <w:pStyle w:val="Heading3"/>
+      </w:pPr>
+      <w:r>
+        <w:t>4.24 StreakHistory / StreakMilestone</w:t>
+      </w:r>
+    </w:p>
+    <w:p>
+      <w:r>
+        <w:t>Visual streak tracking components:</w:t>
+      </w:r>
+    </w:p>
+    <w:p>
+      <w:pPr>
+        <w:pStyle w:val="ListBullet"/>
+      </w:pPr>
+      <w:r>
+        <w:t>StreakHistory: Calendar-style grid showing daily activity (green = active, gray = missed)</w:t>
+      </w:r>
+    </w:p>
+    <w:p>
+      <w:pPr>
+        <w:pStyle w:val="ListBullet"/>
+      </w:pPr>
+      <w:r>
+        <w:t>StreakMilestone: Celebration card shown at streak milestones (7, 14, 30, 60, 100 days)</w:t>
+      </w:r>
+    </w:p>
+    <w:p>
+      <w:pPr>
+        <w:pStyle w:val="ListBullet"/>
+      </w:pPr>
+      <w:r>
+        <w:t>Flame icon with animated glow at milestones</w:t>
+      </w:r>
+    </w:p>
+    <w:p>
+      <w:pPr>
+        <w:pStyle w:val="ListBullet"/>
+      </w:pPr>
+      <w:r>
+        <w:t>Streak recovery prompt when streak is broken (freeze token option)</w:t>
+      </w:r>
+    </w:p>
+    <w:p>
+      <w:pPr>
+        <w:pStyle w:val="Heading3"/>
+      </w:pPr>
+      <w:r>
+        <w:t>4.25 WalletPage / CreditTopUpModal</w:t>
+      </w:r>
+    </w:p>
+    <w:p>
+      <w:r>
+        <w:t>Credit management interface:</w:t>
+      </w:r>
+    </w:p>
+    <w:p>
+      <w:pPr>
+        <w:pStyle w:val="ListBullet"/>
+      </w:pPr>
+      <w:r>
+        <w:t>WalletPage: Balance display with dual pools (package credits + purchased credits), package tier badge, auto-refill toggle, transaction history table</w:t>
+      </w:r>
+    </w:p>
+    <w:p>
+      <w:pPr>
+        <w:pStyle w:val="ListBullet"/>
+      </w:pPr>
+      <w:r>
+        <w:t>CreditTopUpModal: Credit amount selector, price display, checkout CTA</w:t>
+      </w:r>
+    </w:p>
+    <w:p>
+      <w:pPr>
+        <w:pStyle w:val="ListBullet"/>
+      </w:pPr>
+      <w:r>
+        <w:t>StorageUsageBar: Visual quota bar showing used vs. available storage (color transitions at 75% and 90%)</w:t>
+      </w:r>
+    </w:p>
+    <w:p>
+      <w:pPr>
+        <w:pStyle w:val="ListBullet"/>
+      </w:pPr>
+      <w:r>
+        <w:t>AICreditsDisplay: Compact credit balance in header with click-to-expand</w:t>
+      </w:r>
+    </w:p>
+    <w:p>
+      <w:pPr>
+        <w:pStyle w:val="Heading3"/>
+      </w:pPr>
+      <w:r>
+        <w:t>4.26 PackageSelector</w:t>
+      </w:r>
+    </w:p>
+    <w:p>
+      <w:r>
+        <w:t>Tier comparison component:</w:t>
+      </w:r>
+    </w:p>
+    <w:p>
+      <w:pPr>
+        <w:pStyle w:val="ListBullet"/>
+      </w:pPr>
+      <w:r>
+        <w:t>Card-based layout (Free / Plus / Unlimited)</w:t>
+      </w:r>
+    </w:p>
+    <w:p>
+      <w:pPr>
+        <w:pStyle w:val="ListBullet"/>
+      </w:pPr>
+      <w:r>
+        <w:t>Feature list per tier with checkmarks</w:t>
+      </w:r>
+    </w:p>
+    <w:p>
+      <w:pPr>
+        <w:pStyle w:val="ListBullet"/>
+      </w:pPr>
+      <w:r>
+        <w:t>Monthly credit allocation and pricing</w:t>
+      </w:r>
+    </w:p>
+    <w:p>
+      <w:pPr>
+        <w:pStyle w:val="ListBullet"/>
+      </w:pPr>
+      <w:r>
+        <w:t>Current plan highlight with badge</w:t>
+      </w:r>
+    </w:p>
+    <w:p>
+      <w:pPr>
+        <w:pStyle w:val="ListBullet"/>
+      </w:pPr>
+      <w:r>
+        <w:t>Upgrade CTA buttons</w:t>
+      </w:r>
+    </w:p>
+    <w:p>
+      <w:pPr>
+        <w:pStyle w:val="ListBullet"/>
+      </w:pPr>
+      <w:r>
+        <w:t>Used in wallet page, onboarding, and upgrade prompts</w:t>
+      </w:r>
+    </w:p>
+    <w:p>
+      <w:pPr>
+        <w:pStyle w:val="Heading3"/>
+      </w:pPr>
+      <w:r>
+        <w:t>4.27 SchoolReportCardUpload</w:t>
+      </w:r>
+    </w:p>
+    <w:p>
+      <w:r>
+        <w:t>Report card upload and analysis interface:</w:t>
+      </w:r>
+    </w:p>
+    <w:p>
+      <w:pPr>
+        <w:pStyle w:val="ListBullet"/>
+      </w:pPr>
+      <w:r>
+        <w:t>File upload zone (PDF/image, drag-and-drop)</w:t>
+      </w:r>
+    </w:p>
+    <w:p>
+      <w:pPr>
+        <w:pStyle w:val="ListBullet"/>
+      </w:pPr>
+      <w:r>
+        <w:t>OCR processing progress indicator with step labels</w:t>
+      </w:r>
+    </w:p>
+    <w:p>
+      <w:pPr>
+        <w:pStyle w:val="ListBullet"/>
+      </w:pPr>
+      <w:r>
+        <w:t>AI analysis results display: subject grades table, strengths/weaknesses summary</w:t>
+      </w:r>
+    </w:p>
+    <w:p>
+      <w:pPr>
+        <w:pStyle w:val="ListBullet"/>
+      </w:pPr>
+      <w:r>
+        <w:t>Career path suggestions cards with descriptions</w:t>
+      </w:r>
+    </w:p>
+    <w:p>
+      <w:pPr>
+        <w:pStyle w:val="ListBullet"/>
+      </w:pPr>
+      <w:r>
+        <w:t>Report card history list per student</w:t>
+      </w:r>
+    </w:p>
+    <w:p>
+      <w:pPr>
+        <w:pStyle w:val="Heading3"/>
+      </w:pPr>
+      <w:r>
+        <w:t>4.28 ReadinessCheckPage</w:t>
+      </w:r>
+    </w:p>
+    <w:p>
+      <w:r>
+        <w:t>Assessment interface components:</w:t>
+      </w:r>
+    </w:p>
+    <w:p>
+      <w:pPr>
+        <w:pStyle w:val="ListBullet"/>
+      </w:pPr>
+      <w:r>
+        <w:t>AssessmentCountdown: Timer bar with remaining time display</w:t>
+      </w:r>
+    </w:p>
+    <w:p>
+      <w:pPr>
+        <w:pStyle w:val="ListBullet"/>
+      </w:pPr>
+      <w:r>
+        <w:t>Question stepper: one question at a time, progress dots</w:t>
+      </w:r>
+    </w:p>
+    <w:p>
+      <w:pPr>
+        <w:pStyle w:val="ListBullet"/>
+      </w:pPr>
+      <w:r>
+        <w:t>Answer input with submit button</w:t>
+      </w:r>
+    </w:p>
+    <w:p>
+      <w:pPr>
+        <w:pStyle w:val="ListBullet"/>
+      </w:pPr>
+      <w:r>
+        <w:t>Gap report display for parents: strengths (green), areas needing attention (amber/red)</w:t>
+      </w:r>
+    </w:p>
+    <w:p>
+      <w:pPr>
+        <w:pStyle w:val="ListBullet"/>
+      </w:pPr>
+      <w:r>
+        <w:t>"Start Assessment" CTA card on parent dashboard</w:t>
+      </w:r>
+    </w:p>
+    <w:p>
+      <w:pPr>
+        <w:pStyle w:val="Heading3"/>
+      </w:pPr>
+      <w:r>
+        <w:t>4.29 StudySessionPage / PomodoroTimer</w:t>
+      </w:r>
+    </w:p>
+    <w:p>
+      <w:r>
+        <w:t>Study session tracking interface:</w:t>
+      </w:r>
+    </w:p>
+    <w:p>
+      <w:pPr>
+        <w:pStyle w:val="ListBullet"/>
+      </w:pPr>
+      <w:r>
+        <w:t>PomodoroTimer: Circular timer with start/pause/reset controls, configurable duration (25/45/60 min)</w:t>
+      </w:r>
+    </w:p>
+    <w:p>
+      <w:pPr>
+        <w:pStyle w:val="ListBullet"/>
+      </w:pPr>
+      <w:r>
+        <w:t>Session history list with date, duration, and study material link</w:t>
+      </w:r>
+    </w:p>
+    <w:p>
+      <w:pPr>
+        <w:pStyle w:val="ListBullet"/>
+      </w:pPr>
+      <w:r>
+        <w:t>StudyTimeSuggestions: Recommended study times based on upcoming deadlines</w:t>
+      </w:r>
+    </w:p>
+    <w:p>
+      <w:pPr>
+        <w:pStyle w:val="ListBullet"/>
+      </w:pPr>
+      <w:r>
+        <w:t>StudyGoalSelector: Set daily/weekly study time targets</w:t>
+      </w:r>
+    </w:p>
+    <w:p>
+      <w:pPr>
+        <w:pStyle w:val="ListBullet"/>
+      </w:pPr>
+      <w:r>
+        <w:t>Stats cards: total sessions, total time, average session length</w:t>
+      </w:r>
+    </w:p>
+    <w:p>
+      <w:pPr>
+        <w:pStyle w:val="Heading3"/>
+      </w:pPr>
+      <w:r>
+        <w:t>4.30 DailyQuiz / QuizOfTheDay</w:t>
+      </w:r>
+    </w:p>
+    <w:p>
+      <w:r>
+        <w:t>Daily engagement components:</w:t>
+      </w:r>
+    </w:p>
+    <w:p>
+      <w:pPr>
+        <w:pStyle w:val="ListBullet"/>
+      </w:pPr>
+      <w:r>
+        <w:t>QuizOfTheDay: Dashboard card with quiz prompt, one-click start</w:t>
+      </w:r>
+    </w:p>
+    <w:p>
+      <w:pPr>
+        <w:pStyle w:val="ListBullet"/>
+      </w:pPr>
+      <w:r>
+        <w:t>Compact quiz interface: question + 4 choices + submit</w:t>
+      </w:r>
+    </w:p>
+    <w:p>
+      <w:pPr>
+        <w:pStyle w:val="ListBullet"/>
+      </w:pPr>
+      <w:r>
+        <w:t>Completion celebration with XP earned display</w:t>
+      </w:r>
+    </w:p>
+    <w:p>
+      <w:pPr>
+        <w:pStyle w:val="ListBullet"/>
+      </w:pPr>
+      <w:r>
+        <w:t>Streak bonus indicator for consecutive daily completions</w:t>
+      </w:r>
+    </w:p>
+    <w:p>
+      <w:pPr>
+        <w:pStyle w:val="Heading3"/>
+      </w:pPr>
+      <w:r>
+        <w:t>4.31 MindMap Component (Updated)</w:t>
+      </w:r>
+    </w:p>
+    <w:tbl>
+      <w:tblPr>
+        <w:tblStyle w:val="TableGrid"/>
+        <w:tblW w:type="auto" w:w="0"/>
+        <w:jc w:val="left"/>
+        <w:tblLook w:firstColumn="1" w:firstRow="1" w:lastColumn="0" w:lastRow="0" w:noHBand="0" w:noVBand="1" w:val="04A0"/>
+      </w:tblPr>
+      <w:tblGrid>
+        <w:gridCol w:w="4703"/>
+        <w:gridCol w:w="4703"/>
+      </w:tblGrid>
+      <w:tr>
+        <w:tc>
+          <w:tcPr>
+            <w:tcW w:type="dxa" w:w="4703"/>
+            <w:shd w:fill="49B8C0" w:val="clear"/>
+          </w:tcPr>
+          <w:p>
+            <w:r>
+              <w:rPr>
+                <w:rFonts w:ascii="Calibri" w:hAnsi="Calibri"/>
+                <w:b/>
+                <w:color w:val="FFFFFF"/>
+                <w:sz w:val="20"/>
+              </w:rPr>
+              <w:t>Viewport</w:t>
+            </w:r>
+          </w:p>
+        </w:tc>
+        <w:tc>
+          <w:tcPr>
+            <w:tcW w:type="dxa" w:w="4703"/>
+            <w:shd w:fill="49B8C0" w:val="clear"/>
+          </w:tcPr>
+          <w:p>
+            <w:r>
+              <w:rPr>
+                <w:rFonts w:ascii="Calibri" w:hAnsi="Calibri"/>
+                <w:b/>
+                <w:color w:val="FFFFFF"/>
+                <w:sz w:val="20"/>
+              </w:rPr>
+              <w:t>Layout</w:t>
+            </w:r>
+          </w:p>
+        </w:tc>
+      </w:tr>
+      <w:tr>
+        <w:tc>
+          <w:tcPr>
+            <w:tcW w:type="dxa" w:w="4703"/>
+          </w:tcPr>
+          <w:p>
+            <w:r>
+              <w:rPr>
+                <w:rFonts w:ascii="Calibri" w:hAnsi="Calibri"/>
+                <w:sz w:val="20"/>
+              </w:rPr>
+              <w:t>Desktop (≥768px)</w:t>
+            </w:r>
+          </w:p>
+        </w:tc>
+        <w:tc>
+          <w:tcPr>
+            <w:tcW w:type="dxa" w:w="4703"/>
+          </w:tcPr>
+          <w:p>
+            <w:r>
+              <w:rPr>
+                <w:rFonts w:ascii="Calibri" w:hAnsi="Calibri"/>
+                <w:sz w:val="20"/>
+              </w:rPr>
+              <w:t>Horizontal — center node in middle, branches split left/right with vertical stacking to prevent overlap</w:t>
+            </w:r>
+          </w:p>
+        </w:tc>
+      </w:tr>
+      <w:tr>
+        <w:tc>
+          <w:tcPr>
+            <w:tcW w:type="dxa" w:w="4703"/>
+            <w:shd w:fill="F0F7FA" w:val="clear"/>
+          </w:tcPr>
+          <w:p>
+            <w:r>
+              <w:rPr>
+                <w:rFonts w:ascii="Calibri" w:hAnsi="Calibri"/>
+                <w:sz w:val="20"/>
+              </w:rPr>
+              <w:t>Mobile (&lt;768px)</w:t>
+            </w:r>
+          </w:p>
+        </w:tc>
+        <w:tc>
+          <w:tcPr>
+            <w:tcW w:type="dxa" w:w="4703"/>
+            <w:shd w:fill="F0F7FA" w:val="clear"/>
+          </w:tcPr>
+          <w:p>
+            <w:r>
+              <w:rPr>
+                <w:rFonts w:ascii="Calibri" w:hAnsi="Calibri"/>
+                <w:sz w:val="20"/>
+              </w:rPr>
+              <w:t>Vertical stacked list layout</w:t>
+            </w:r>
+          </w:p>
+        </w:tc>
+      </w:tr>
+    </w:tbl>
+    <w:p/>
+    <w:p>
+      <w:pPr>
+        <w:pStyle w:val="ListBullet"/>
+      </w:pPr>
+      <w:r>
+        <w:t>Connector lines from center node to each branch label</w:t>
+      </w:r>
+    </w:p>
+    <w:p>
+      <w:pPr>
+        <w:pStyle w:val="ListBullet"/>
+      </w:pPr>
+      <w:r>
+        <w:t>Branches must not overlap when child items are expanded</w:t>
+      </w:r>
+    </w:p>
+    <w:p>
+      <w:pPr>
+        <w:pStyle w:val="ListBullet"/>
+      </w:pPr>
+      <w:r>
+        <w:t>Available via "Learn Your Way" format selector and Help Study menu</w:t>
+      </w:r>
+    </w:p>
+    <w:p>
+      <w:pPr>
+        <w:pStyle w:val="ListBullet"/>
+      </w:pPr>
+      <w:r>
+        <w:t>Color-coded branches by topic area</w:t>
+      </w:r>
+    </w:p>
+    <w:p>
+      <w:pPr>
+        <w:pStyle w:val="Heading3"/>
+      </w:pPr>
+      <w:r>
+        <w:t>4.32 SpeedDialFAB (Updated Details)</w:t>
+      </w:r>
+    </w:p>
+    <w:p>
+      <w:r>
+        <w:t>Enhanced floating action button:</w:t>
+      </w:r>
+    </w:p>
+    <w:p>
+      <w:pPr>
+        <w:pStyle w:val="ListBullet"/>
+      </w:pPr>
+      <w:r>
+        <w:t>56px primary circle button (bottom-right, above NotesFAB)</w:t>
+      </w:r>
+    </w:p>
+    <w:p>
+      <w:pPr>
+        <w:pStyle w:val="ListBullet"/>
+      </w:pPr>
+      <w:r>
+        <w:t>Click expands vertical menu of contextual actions</w:t>
+      </w:r>
+    </w:p>
+    <w:p>
+      <w:pPr>
+        <w:pStyle w:val="ListBullet"/>
+      </w:pPr>
+      <w:r>
+        <w:t>Overlay backdrop dims background on expand</w:t>
+      </w:r>
+    </w:p>
+    <w:p>
+      <w:pPr>
+        <w:pStyle w:val="ListBullet"/>
+      </w:pPr>
+      <w:r>
+        <w:t>Animated rotation of plus icon to X on open</w:t>
+      </w:r>
+    </w:p>
+    <w:p>
+      <w:pPr>
+        <w:pStyle w:val="ListBullet"/>
+      </w:pPr>
+      <w:r>
+        <w:t>Actions vary by role and current page context</w:t>
+      </w:r>
+    </w:p>
+    <w:p>
+      <w:pPr>
+        <w:pStyle w:val="ListBullet"/>
+      </w:pPr>
+      <w:r>
+        <w:t>Integrates help chatbot toggle</w:t>
+      </w:r>
+    </w:p>
+    <w:p>
+      <w:pPr>
+        <w:pStyle w:val="ListBullet"/>
+      </w:pPr>
+      <w:r>
+        <w:t>Mobile: full-width bottom sheet on expand</w:t>
+      </w:r>
+    </w:p>
+    <w:p>
+      <w:pPr>
+        <w:pStyle w:val="Heading3"/>
+      </w:pPr>
+      <w:r>
+        <w:t>4.33 HelpChatbot (Updated)</w:t>
+      </w:r>
+    </w:p>
+    <w:p>
+      <w:r>
+        <w:t>Enhanced AI chatbot with context awareness:</w:t>
+      </w:r>
+    </w:p>
+    <w:p>
+      <w:pPr>
+        <w:pStyle w:val="ListBullet"/>
+      </w:pPr>
+      <w:r>
+        <w:t>Context-aware suggestion chips: Change based on current page (e.g., study guide page shows "Explain this topic")</w:t>
+      </w:r>
+    </w:p>
+    <w:p>
+      <w:pPr>
+        <w:pStyle w:val="ListBullet"/>
+      </w:pPr>
+      <w:r>
+        <w:t>RAG-powered responses: Retrieves from knowledge base articles via embeddings</w:t>
+      </w:r>
+    </w:p>
+    <w:p>
+      <w:pPr>
+        <w:pStyle w:val="ListBullet"/>
+      </w:pPr>
+      <w:r>
+        <w:t>Video embed support: YouTube/Loom inline players in chat</w:t>
+      </w:r>
+    </w:p>
+    <w:p>
+      <w:pPr>
+        <w:pStyle w:val="ListBullet"/>
+      </w:pPr>
+      <w:r>
+        <w:t>Role-specific topics: Different help suggestions per user role</w:t>
+      </w:r>
+    </w:p>
+    <w:p>
+      <w:pPr>
+        <w:pStyle w:val="ListBullet"/>
+      </w:pPr>
+      <w:r>
+        <w:t>Save as Guide: Convert chatbot answer to new study guide</w:t>
+      </w:r>
+    </w:p>
+    <w:p>
+      <w:pPr>
+        <w:pStyle w:val="ListBullet"/>
+      </w:pPr>
+      <w:r>
+        <w:t>Save as Material: Add chatbot answer as course material</w:t>
+      </w:r>
+    </w:p>
+    <w:p>
+      <w:pPr>
+        <w:pStyle w:val="ListBullet"/>
+      </w:pPr>
+      <w:r>
+        <w:t>Streaming responses: Real-time markdown rendering during generation</w:t>
+      </w:r>
+    </w:p>
+    <w:p>
+      <w:pPr>
+        <w:pStyle w:val="Heading3"/>
+      </w:pPr>
+      <w:r>
+        <w:t>4.34 BugReportModal (Updated)</w:t>
+      </w:r>
+    </w:p>
+    <w:p>
+      <w:r>
+        <w:t>In-app bug submission form:</w:t>
+      </w:r>
+    </w:p>
+    <w:p>
+      <w:pPr>
+        <w:pStyle w:val="ListBullet"/>
+      </w:pPr>
+      <w:r>
+        <w:t>Accessible via "Report a Bug" link in footer or help menu</w:t>
+      </w:r>
+    </w:p>
+    <w:p>
+      <w:pPr>
+        <w:pStyle w:val="ListBullet"/>
+      </w:pPr>
+      <w:r>
+        <w:t>Fields: description (required), steps to reproduce, severity selector (low/medium/high/critical)</w:t>
+      </w:r>
+    </w:p>
+    <w:p>
+      <w:pPr>
+        <w:pStyle w:val="ListBullet"/>
+      </w:pPr>
+      <w:r>
+        <w:t>Browser info auto-captured (user agent, viewport size)</w:t>
+      </w:r>
+    </w:p>
+    <w:p>
+      <w:pPr>
+        <w:pStyle w:val="ListBullet"/>
+      </w:pPr>
+      <w:r>
+        <w:t>Optional screenshot upload</w:t>
+      </w:r>
+    </w:p>
+    <w:p>
+      <w:pPr>
+        <w:pStyle w:val="ListBullet"/>
+      </w:pPr>
+      <w:r>
+        <w:t>Submit sends to admin bug report queue</w:t>
+      </w:r>
+    </w:p>
+    <w:p>
+      <w:pPr>
+        <w:pStyle w:val="Heading3"/>
+      </w:pPr>
+      <w:r>
+        <w:t>4.35 CalendarImportPage</w:t>
+      </w:r>
+    </w:p>
+    <w:p>
+      <w:r>
+        <w:t>Calendar sync management interface:</w:t>
+      </w:r>
+    </w:p>
+    <w:p>
+      <w:pPr>
+        <w:pStyle w:val="ListBullet"/>
+      </w:pPr>
+      <w:r>
+        <w:t>Feed URL input with auto-detect (iCal/Google Calendar)</w:t>
+      </w:r>
+    </w:p>
+    <w:p>
+      <w:pPr>
+        <w:pStyle w:val="ListBullet"/>
+      </w:pPr>
+      <w:r>
+        <w:t>ICS file upload drag-and-drop zone</w:t>
+      </w:r>
+    </w:p>
+    <w:p>
+      <w:pPr>
+        <w:pStyle w:val="ListBullet"/>
+      </w:pPr>
+      <w:r>
+        <w:t>Active feeds list with last sync time and event count</w:t>
+      </w:r>
+    </w:p>
+    <w:p>
+      <w:pPr>
+        <w:pStyle w:val="ListBullet"/>
+      </w:pPr>
+      <w:r>
+        <w:t>Manual sync trigger button per feed</w:t>
+      </w:r>
+    </w:p>
+    <w:p>
+      <w:pPr>
+        <w:pStyle w:val="ListBullet"/>
+      </w:pPr>
+      <w:r>
+        <w:t>Delete feed with cascade event removal</w:t>
+      </w:r>
+    </w:p>
+    <w:p>
+      <w:pPr>
+        <w:pStyle w:val="ListBullet"/>
+      </w:pPr>
+      <w:r>
+        <w:t>Imported events display in main calendar views</w:t>
+      </w:r>
+    </w:p>
+    <w:p>
+      <w:pPr>
+        <w:pStyle w:val="Heading3"/>
+      </w:pPr>
+      <w:r>
+        <w:t>4.36 OnboardingTour (Updated)</w:t>
+      </w:r>
+    </w:p>
+    <w:p>
+      <w:r>
+        <w:t>Step-by-step interactive tour:</w:t>
+      </w:r>
+    </w:p>
+    <w:p>
+      <w:pPr>
+        <w:pStyle w:val="ListBullet"/>
+      </w:pPr>
+      <w:r>
+        <w:t>Highlight target elements with dimmed backdrop overlay</w:t>
+      </w:r>
+    </w:p>
+    <w:p>
+      <w:pPr>
+        <w:pStyle w:val="ListBullet"/>
+      </w:pPr>
+      <w:r>
+        <w:t>Tooltip cards with title, description, and step image</w:t>
+      </w:r>
+    </w:p>
+    <w:p>
+      <w:pPr>
+        <w:pStyle w:val="ListBullet"/>
+      </w:pPr>
+      <w:r>
+        <w:t>Progress dots (clickable, checkmark for visited)</w:t>
+      </w:r>
+    </w:p>
+    <w:p>
+      <w:pPr>
+        <w:pStyle w:val="ListBullet"/>
+      </w:pPr>
+      <w:r>
+        <w:t>Previous/Next/Skip navigation</w:t>
+      </w:r>
+    </w:p>
+    <w:p>
+      <w:pPr>
+        <w:pStyle w:val="ListBullet"/>
+      </w:pPr>
+      <w:r>
+        <w:t>Role-specific tour steps (parent sees child management, student sees study tools)</w:t>
+      </w:r>
+    </w:p>
+    <w:p>
+      <w:pPr>
+        <w:pStyle w:val="ListBullet"/>
+      </w:pPr>
+      <w:r>
+        <w:t>Auto-dismisses when all steps completed</w:t>
+      </w:r>
+    </w:p>
+    <w:p>
+      <w:pPr>
+        <w:pStyle w:val="ListBullet"/>
+      </w:pPr>
+      <w:r>
+        <w:t>Can be reset from settings</w:t>
+      </w:r>
+    </w:p>
+    <w:p>
+      <w:pPr>
+        <w:pStyle w:val="Heading3"/>
+      </w:pPr>
+      <w:r>
+        <w:t>4.37 StreamingMarkdown</w:t>
+      </w:r>
+    </w:p>
+    <w:p>
+      <w:r>
+        <w:t>Real-time markdown rendering during AI generation:</w:t>
+      </w:r>
+    </w:p>
+    <w:p>
+      <w:pPr>
+        <w:pStyle w:val="ListBullet"/>
+      </w:pPr>
+      <w:r>
+        <w:t>Progressive content display as tokens arrive</w:t>
+      </w:r>
+    </w:p>
+    <w:p>
+      <w:pPr>
+        <w:pStyle w:val="ListBullet"/>
+      </w:pPr>
+      <w:r>
+        <w:t>Syntax highlighting for code blocks</w:t>
+      </w:r>
+    </w:p>
+    <w:p>
+      <w:pPr>
+        <w:pStyle w:val="ListBullet"/>
+      </w:pPr>
+      <w:r>
+        <w:t>Math formula rendering (KaTeX)</w:t>
+      </w:r>
+    </w:p>
+    <w:p>
+      <w:pPr>
+        <w:pStyle w:val="ListBullet"/>
+      </w:pPr>
+      <w:r>
+        <w:t>Cursor animation at end of streaming content</w:t>
+      </w:r>
+    </w:p>
+    <w:p>
+      <w:pPr>
+        <w:pStyle w:val="ListBullet"/>
+      </w:pPr>
+      <w:r>
+        <w:t>Graceful handling of partial markdown (unclosed tags)</w:t>
+      </w:r>
+    </w:p>
+    <w:p>
+      <w:pPr>
+        <w:pStyle w:val="Heading3"/>
+      </w:pPr>
+      <w:r>
+        <w:t>4.38 TransactionHistory</w:t>
+      </w:r>
+    </w:p>
+    <w:p>
+      <w:r>
+        <w:t>Wallet transaction log component:</w:t>
+      </w:r>
+    </w:p>
+    <w:p>
+      <w:pPr>
+        <w:pStyle w:val="ListBullet"/>
+      </w:pPr>
+      <w:r>
+        <w:t>Table with columns: Date, Description, Amount (+/-), Balance</w:t>
+      </w:r>
+    </w:p>
+    <w:p>
+      <w:pPr>
+        <w:pStyle w:val="ListBullet"/>
+      </w:pPr>
+      <w:r>
+        <w:t>Credit additions in green, debits in red</w:t>
+      </w:r>
+    </w:p>
+    <w:p>
+      <w:pPr>
+        <w:pStyle w:val="ListBullet"/>
+      </w:pPr>
+      <w:r>
+        <w:t>Filter by date range and transaction type</w:t>
+      </w:r>
+    </w:p>
+    <w:p>
+      <w:pPr>
+        <w:pStyle w:val="ListBullet"/>
+      </w:pPr>
+      <w:r>
+        <w:t>Pagination for long histories</w:t>
+      </w:r>
+    </w:p>
+    <w:p>
+      <w:pPr>
+        <w:pStyle w:val="ListBullet"/>
+      </w:pPr>
+      <w:r>
+        <w:t>Used in WalletPage</w:t>
       </w:r>
     </w:p>
     <w:p>
@@ -4039,6 +5200,358 @@
     </w:p>
     <w:p>
       <w:pPr>
+        <w:pStyle w:val="Heading3"/>
+      </w:pPr>
+      <w:r>
+        <w:t>6.8 CSV Import Page</w:t>
+      </w:r>
+    </w:p>
+    <w:p>
+      <w:pPr>
+        <w:pStyle w:val="ListBullet"/>
+      </w:pPr>
+      <w:r>
+        <w:t>Template Selection: Card grid for import type (Students, Courses, Assignments)</w:t>
+      </w:r>
+    </w:p>
+    <w:p>
+      <w:pPr>
+        <w:pStyle w:val="ListBullet"/>
+      </w:pPr>
+      <w:r>
+        <w:t>Upload Zone: Drag-and-drop with file type validation (.csv only)</w:t>
+      </w:r>
+    </w:p>
+    <w:p>
+      <w:pPr>
+        <w:pStyle w:val="ListBullet"/>
+      </w:pPr>
+      <w:r>
+        <w:t>Preview Table: Color-coded rows (green = valid, red = errors with inline messages)</w:t>
+      </w:r>
+    </w:p>
+    <w:p>
+      <w:pPr>
+        <w:pStyle w:val="ListBullet"/>
+      </w:pPr>
+      <w:r>
+        <w:t>Results Summary: Import count, error count, download error report button</w:t>
+      </w:r>
+    </w:p>
+    <w:p>
+      <w:pPr>
+        <w:pStyle w:val="ListBullet"/>
+      </w:pPr>
+      <w:r>
+        <w:t>Step indicator: Template → Upload → Preview → Done</w:t>
+      </w:r>
+    </w:p>
+    <w:p>
+      <w:pPr>
+        <w:pStyle w:val="Heading3"/>
+      </w:pPr>
+      <w:r>
+        <w:t>6.9 Wallet Page</w:t>
+      </w:r>
+    </w:p>
+    <w:p>
+      <w:pPr>
+        <w:pStyle w:val="ListBullet"/>
+      </w:pPr>
+      <w:r>
+        <w:t>Balance Cards: Package credits + purchased credits side by side</w:t>
+      </w:r>
+    </w:p>
+    <w:p>
+      <w:pPr>
+        <w:pStyle w:val="ListBullet"/>
+      </w:pPr>
+      <w:r>
+        <w:t>Package Tier Badge: Current plan name with colored indicator</w:t>
+      </w:r>
+    </w:p>
+    <w:p>
+      <w:pPr>
+        <w:pStyle w:val="ListBullet"/>
+      </w:pPr>
+      <w:r>
+        <w:t>Auto-Refill Toggle: Switch with threshold input</w:t>
+      </w:r>
+    </w:p>
+    <w:p>
+      <w:pPr>
+        <w:pStyle w:val="ListBullet"/>
+      </w:pPr>
+      <w:r>
+        <w:t>Package Comparison: Card grid showing Free/Plus/Unlimited tiers</w:t>
+      </w:r>
+    </w:p>
+    <w:p>
+      <w:pPr>
+        <w:pStyle w:val="ListBullet"/>
+      </w:pPr>
+      <w:r>
+        <w:t>Transaction History: Paginated table with credit/debit indicators</w:t>
+      </w:r>
+    </w:p>
+    <w:p>
+      <w:pPr>
+        <w:pStyle w:val="ListBullet"/>
+      </w:pPr>
+      <w:r>
+        <w:t>Top-Up CTA: Prominent button opening CreditTopUpModal</w:t>
+      </w:r>
+    </w:p>
+    <w:p>
+      <w:pPr>
+        <w:pStyle w:val="Heading3"/>
+      </w:pPr>
+      <w:r>
+        <w:t>6.10 XP History Page</w:t>
+      </w:r>
+    </w:p>
+    <w:p>
+      <w:pPr>
+        <w:pStyle w:val="ListBullet"/>
+      </w:pPr>
+      <w:r>
+        <w:t>Level Progress: Large progress bar showing XP toward next level</w:t>
+      </w:r>
+    </w:p>
+    <w:p>
+      <w:pPr>
+        <w:pStyle w:val="ListBullet"/>
+      </w:pPr>
+      <w:r>
+        <w:t>Stats Row: Total XP, Current Level, Current Streak, Longest Streak</w:t>
+      </w:r>
+    </w:p>
+    <w:p>
+      <w:pPr>
+        <w:pStyle w:val="ListBullet"/>
+      </w:pPr>
+      <w:r>
+        <w:t>XP Timeline: Chronological list of XP-earning events with action type icons</w:t>
+      </w:r>
+    </w:p>
+    <w:p>
+      <w:pPr>
+        <w:pStyle w:val="ListBullet"/>
+      </w:pPr>
+      <w:r>
+        <w:t>Badge Gallery Link: Navigate to badges page</w:t>
+      </w:r>
+    </w:p>
+    <w:p>
+      <w:pPr>
+        <w:pStyle w:val="Heading3"/>
+      </w:pPr>
+      <w:r>
+        <w:t>6.11 Badges Page</w:t>
+      </w:r>
+    </w:p>
+    <w:p>
+      <w:pPr>
+        <w:pStyle w:val="ListBullet"/>
+      </w:pPr>
+      <w:r>
+        <w:t>Badge Grid: 3-4 column grid of badge cards</w:t>
+      </w:r>
+    </w:p>
+    <w:p>
+      <w:pPr>
+        <w:pStyle w:val="ListBullet"/>
+      </w:pPr>
+      <w:r>
+        <w:t>Unlocked Badges: Full color with unlock date</w:t>
+      </w:r>
+    </w:p>
+    <w:p>
+      <w:pPr>
+        <w:pStyle w:val="ListBullet"/>
+      </w:pPr>
+      <w:r>
+        <w:t>Locked Badges: Grayscale with progress indicator and requirement text</w:t>
+      </w:r>
+    </w:p>
+    <w:p>
+      <w:pPr>
+        <w:pStyle w:val="ListBullet"/>
+      </w:pPr>
+      <w:r>
+        <w:t>Badge Detail: Click to expand with description and criteria</w:t>
+      </w:r>
+    </w:p>
+    <w:p>
+      <w:pPr>
+        <w:pStyle w:val="Heading3"/>
+      </w:pPr>
+      <w:r>
+        <w:t>6.12 Study Session Page</w:t>
+      </w:r>
+    </w:p>
+    <w:p>
+      <w:pPr>
+        <w:pStyle w:val="ListBullet"/>
+      </w:pPr>
+      <w:r>
+        <w:t>Active Session Panel: Large Pomodoro timer, current material info, pause/stop controls</w:t>
+      </w:r>
+    </w:p>
+    <w:p>
+      <w:pPr>
+        <w:pStyle w:val="ListBullet"/>
+      </w:pPr>
+      <w:r>
+        <w:t>Session Log: Recent sessions with date, duration, and material</w:t>
+      </w:r>
+    </w:p>
+    <w:p>
+      <w:pPr>
+        <w:pStyle w:val="ListBullet"/>
+      </w:pPr>
+      <w:r>
+        <w:t>Stats Cards: Total time this week, sessions count, average duration</w:t>
+      </w:r>
+    </w:p>
+    <w:p>
+      <w:pPr>
+        <w:pStyle w:val="ListBullet"/>
+      </w:pPr>
+      <w:r>
+        <w:t>Study Goal Progress: Weekly target bar</w:t>
+      </w:r>
+    </w:p>
+    <w:p>
+      <w:pPr>
+        <w:pStyle w:val="Heading3"/>
+      </w:pPr>
+      <w:r>
+        <w:t>6.13 Readiness Check Page</w:t>
+      </w:r>
+    </w:p>
+    <w:p>
+      <w:pPr>
+        <w:pStyle w:val="ListBullet"/>
+      </w:pPr>
+      <w:r>
+        <w:t>Assessment Card: Subject, question count, time limit</w:t>
+      </w:r>
+    </w:p>
+    <w:p>
+      <w:pPr>
+        <w:pStyle w:val="ListBullet"/>
+      </w:pPr>
+      <w:r>
+        <w:t>Question View: Single question with answer input, progress bar</w:t>
+      </w:r>
+    </w:p>
+    <w:p>
+      <w:pPr>
+        <w:pStyle w:val="ListBullet"/>
+      </w:pPr>
+      <w:r>
+        <w:t>Timer Bar: Countdown timer at top</w:t>
+      </w:r>
+    </w:p>
+    <w:p>
+      <w:pPr>
+        <w:pStyle w:val="ListBullet"/>
+      </w:pPr>
+      <w:r>
+        <w:t>Report View: Strengths/weaknesses grid with color-coded indicators</w:t>
+      </w:r>
+    </w:p>
+    <w:p>
+      <w:pPr>
+        <w:pStyle w:val="ListBullet"/>
+      </w:pPr>
+      <w:r>
+        <w:t>Parent vs Student View: Parent sees full gap report; student sees questions only</w:t>
+      </w:r>
+    </w:p>
+    <w:p>
+      <w:pPr>
+        <w:pStyle w:val="Heading3"/>
+      </w:pPr>
+      <w:r>
+        <w:t>6.14 Report Card Analysis Page</w:t>
+      </w:r>
+    </w:p>
+    <w:p>
+      <w:pPr>
+        <w:pStyle w:val="ListBullet"/>
+      </w:pPr>
+      <w:r>
+        <w:t>Upload Section: Drag-and-drop zone for PDF/image report cards</w:t>
+      </w:r>
+    </w:p>
+    <w:p>
+      <w:pPr>
+        <w:pStyle w:val="ListBullet"/>
+      </w:pPr>
+      <w:r>
+        <w:t>Analysis Card: Extracted grades table, subject strengths chart</w:t>
+      </w:r>
+    </w:p>
+    <w:p>
+      <w:pPr>
+        <w:pStyle w:val="ListBullet"/>
+      </w:pPr>
+      <w:r>
+        <w:t>Career Path Panel: Suggested career paths with alignment scores</w:t>
+      </w:r>
+    </w:p>
+    <w:p>
+      <w:pPr>
+        <w:pStyle w:val="ListBullet"/>
+      </w:pPr>
+      <w:r>
+        <w:t>History List: Past report cards with dates and schools</w:t>
+      </w:r>
+    </w:p>
+    <w:p>
+      <w:pPr>
+        <w:pStyle w:val="Heading3"/>
+      </w:pPr>
+      <w:r>
+        <w:t>6.15 Data Export Page</w:t>
+      </w:r>
+    </w:p>
+    <w:p>
+      <w:pPr>
+        <w:pStyle w:val="ListBullet"/>
+      </w:pPr>
+      <w:r>
+        <w:t>Export Format Selector: JSON or CSV radio buttons</w:t>
+      </w:r>
+    </w:p>
+    <w:p>
+      <w:pPr>
+        <w:pStyle w:val="ListBullet"/>
+      </w:pPr>
+      <w:r>
+        <w:t>Export Request Button: Triggers async export generation</w:t>
+      </w:r>
+    </w:p>
+    <w:p>
+      <w:pPr>
+        <w:pStyle w:val="ListBullet"/>
+      </w:pPr>
+      <w:r>
+        <w:t>Export History Table: Past exports with status, date, download link</w:t>
+      </w:r>
+    </w:p>
+    <w:p>
+      <w:pPr>
+        <w:pStyle w:val="ListBullet"/>
+      </w:pPr>
+      <w:r>
+        <w:t>Download Links: Time-limited token-based download URLs</w:t>
+      </w:r>
+    </w:p>
+    <w:p>
+      <w:pPr>
         <w:pStyle w:val="Heading2"/>
       </w:pPr>
       <w:r>
@@ -9857,51 +11370,7 @@
     </w:p>
     <w:p>
       <w:r>
-        <w:t>This design system document captures the complete visual language, component library (60+ reusable components, 13+ custom hooks), 54+ page components, 40+ API modules, layout patterns, and design decisions for ClassBridge as of March 20, 2026.</w:t>
-      </w:r>
-    </w:p>
-    <w:p>
-      <w:pPr>
-        <w:pStyle w:val="Heading2"/>
-      </w:pPr>
-      <w:r>
-        <w:t>Bug Report Modal Pattern</w:t>
-      </w:r>
-    </w:p>
-    <w:p>
-      <w:r>
-        <w:t>Component: BugReportModal.tsx | Trigger: "Report a Bug" link in error dialogs and help menu</w:t>
-      </w:r>
-    </w:p>
-    <w:p>
-      <w:r>
-        <w:t>Layout: Standard modal (480px max-width). Fields: Description (required), Steps to Reproduce, Expected Behavior, Screenshot (file + paste). Bot protection: hidden honeypot, 60s cooldown timer.</w:t>
-      </w:r>
-    </w:p>
-    <w:p>
-      <w:pPr>
-        <w:pStyle w:val="Heading2"/>
-      </w:pPr>
-      <w:r>
-        <w:t>Streaming Markdown Renderer</w:t>
-      </w:r>
-    </w:p>
-    <w:p>
-      <w:r>
-        <w:t>Component: StreamingMarkdown.tsx | Renders markdown tokens in real-time from SSE endpoints. Blinking cursor during streaming. Inherits study guide typography (16px body, 1.6 line-height).</w:t>
-      </w:r>
-    </w:p>
-    <w:p>
-      <w:pPr>
-        <w:pStyle w:val="Heading2"/>
-      </w:pPr>
-      <w:r>
-        <w:t>Error Dialog to Bug Report Integration</w:t>
-      </w:r>
-    </w:p>
-    <w:p>
-      <w:r>
-        <w:t>All error dialogs include "Report a Bug" link. Opens BugReportModal pre-filled with error context. Implemented in ErrorBoundary and useConfirm hook.</w:t>
+        <w:t>This design system document captures the complete visual language, component library (140+ reusable components, 11+ custom hooks), 100+ page components, 47+ API modules, layout patterns, and design decisions for ClassBridge as of March 27, 2026.</w:t>
       </w:r>
     </w:p>
     <w:sectPr>

</xml_diff>